<commit_message>
Bổ sung STT 12,13
</commit_message>
<xml_diff>
--- a/Mau02.docx
+++ b/Mau02.docx
@@ -3994,7 +3994,7 @@
         <ns0:rPr>
           <ns0:sz ns0:val="22"/>
         </ns0:rPr>
-        <ns0:t>Họ</ns0:t>
+        <ns0:t>12. Họ</ns0:t>
       </ns0:r>
       <ns0:r>
         <ns0:rPr>
@@ -4295,7 +4295,7 @@
         <ns0:rPr>
           <ns0:sz ns0:val="22"/>
         </ns0:rPr>
-        <ns0:t>Mối</ns0:t>
+        <ns0:t>13. Mối</ns0:t>
       </ns0:r>
       <ns0:r>
         <ns0:rPr>
@@ -5893,192 +5893,6 @@
     </ns0:p>
     <ns0:p>
       <ns0:pPr>
-        <ns0:spacing ns0:after="0"/>
-        <ns0:jc ns0:val="left"/>
-        <ns0:rPr>
-          <ns0:sz ns0:val="22"/>
-        </ns0:rPr>
-        <ns0:sectPr>
-          <ns0:type ns0:val="continuous"/>
-          <ns0:pgSz ns0:w="11910" ns0:h="16840"/>
-          <ns0:pgMar ns0:header="585" ns0:footer="0" ns0:top="1040" ns0:bottom="280" ns0:left="1133" ns0:right="566"/>
-          <ns0:cols ns0:num="2" ns0:equalWidth="0">
-            <ns0:col ns0:w="2644" ns0:space="40"/>
-            <ns0:col ns0:w="7527"/>
-          </ns0:cols>
-        </ns0:sectPr>
-      </ns0:pPr>
-    </ns0:p>
-    <ns0:p>
-      <ns0:pPr>
-        <ns0:pStyle ns0:val="BodyText"/>
-        <ns0:rPr>
-          <ns0:sz ns0:val="20"/>
-        </ns0:rPr>
-      </ns0:pPr>
-    </ns0:p>
-    <ns0:p>
-      <ns0:pPr>
-        <ns0:pStyle ns0:val="BodyText"/>
-        <ns0:rPr>
-          <ns0:sz ns0:val="20"/>
-        </ns0:rPr>
-      </ns0:pPr>
-    </ns0:p>
-    <ns0:p>
-      <ns0:pPr>
-        <ns0:pStyle ns0:val="BodyText"/>
-        <ns0:rPr>
-          <ns0:sz ns0:val="20"/>
-        </ns0:rPr>
-      </ns0:pPr>
-    </ns0:p>
-    <ns0:p>
-      <ns0:pPr>
-        <ns0:pStyle ns0:val="BodyText"/>
-        <ns0:rPr>
-          <ns0:sz ns0:val="20"/>
-        </ns0:rPr>
-      </ns0:pPr>
-    </ns0:p>
-    <ns0:p>
-      <ns0:pPr>
-        <ns0:pStyle ns0:val="BodyText"/>
-        <ns0:rPr>
-          <ns0:sz ns0:val="20"/>
-        </ns0:rPr>
-      </ns0:pPr>
-    </ns0:p>
-    <ns0:p>
-      <ns0:pPr>
-        <ns0:pStyle ns0:val="BodyText"/>
-        <ns0:rPr>
-          <ns0:sz ns0:val="20"/>
-        </ns0:rPr>
-      </ns0:pPr>
-    </ns0:p>
-    <ns0:p>
-      <ns0:pPr>
-        <ns0:pStyle ns0:val="BodyText"/>
-        <ns0:rPr>
-          <ns0:sz ns0:val="20"/>
-        </ns0:rPr>
-      </ns0:pPr>
-    </ns0:p>
-    <ns0:p>
-      <ns0:pPr>
-        <ns0:pStyle ns0:val="BodyText"/>
-        <ns0:spacing ns0:before="165"/>
-        <ns0:rPr>
-          <ns0:sz ns0:val="20"/>
-        </ns0:rPr>
-      </ns0:pPr>
-    </ns0:p>
-    <ns0:p>
-      <ns0:pPr>
-        <ns0:spacing ns0:line="20" ns0:lineRule="exact"/>
-        <ns0:ind ns0:left="569" ns0:right="0" ns0:firstLine="0"/>
-        <ns0:rPr>
-          <ns0:sz ns0:val="2"/>
-        </ns0:rPr>
-      </ns0:pPr>
-      <ns0:r>
-        <ns0:rPr>
-          <ns0:sz ns0:val="2"/>
-        </ns0:rPr>
-        <ns1:AlternateContent>
-          <ns1:Choice Requires="wps">
-            <ns0:drawing>
-              <ns2:inline distT="0" distB="0" distL="0" distR="0">
-                <ns2:extent cx="1829435" cy="7620"/>
-                <ns2:effectExtent l="0" t="0" r="0" b="0"/>
-                <ns2:docPr id="37" name="Group 37"/>
-                <ns2:cNvGraphicFramePr>
-                  <ns3:graphicFrameLocks/>
-                </ns2:cNvGraphicFramePr>
-                <ns3:graphic>
-                  <ns3:graphicData uri="http://schemas.microsoft.com/office/word/2010/wordprocessingGroup">
-                    <ns9:wgp>
-                      <ns9:cNvPr id="37" name="Group 37"/>
-                      <ns9:cNvGrpSpPr/>
-                      <ns9:grpSpPr>
-                        <ns3:xfrm>
-                          <ns3:off x="0" y="0"/>
-                          <ns3:ext cx="1829435" cy="7620"/>
-                          <ns3:chExt cx="1829435" cy="7620"/>
-                        </ns3:xfrm>
-                      </ns9:grpSpPr>
-                      <ns6:wsp>
-                        <ns6:cNvPr id="38" name="Graphic 38"/>
-                        <ns6:cNvSpPr/>
-                        <ns6:spPr>
-                          <ns3:xfrm>
-                            <ns3:off x="0" y="0"/>
-                            <ns3:ext cx="1829435" cy="7620"/>
-                          </ns3:xfrm>
-                          <ns3:custGeom>
-                            <ns3:avLst/>
-                            <ns3:gdLst/>
-                            <ns3:ahLst/>
-                            <ns3:cxnLst/>
-                            <ns3:rect l="l" t="t" r="r" b="b"/>
-                            <ns3:pathLst>
-                              <ns3:path w="1829435" h="7620">
-                                <ns3:moveTo>
-                                  <ns3:pt x="1829054" y="0"/>
-                                </ns3:moveTo>
-                                <ns3:lnTo>
-                                  <ns3:pt x="0" y="0"/>
-                                </ns3:lnTo>
-                                <ns3:lnTo>
-                                  <ns3:pt x="0" y="7619"/>
-                                </ns3:lnTo>
-                                <ns3:lnTo>
-                                  <ns3:pt x="1829054" y="7619"/>
-                                </ns3:lnTo>
-                                <ns3:lnTo>
-                                  <ns3:pt x="1829054" y="0"/>
-                                </ns3:lnTo>
-                                <ns3:close/>
-                              </ns3:path>
-                            </ns3:pathLst>
-                          </ns3:custGeom>
-                          <ns3:solidFill>
-                            <ns3:srgbClr val="000000"/>
-                          </ns3:solidFill>
-                        </ns6:spPr>
-                        <ns6:bodyPr wrap="square" lIns="0" tIns="0" rIns="0" bIns="0" rtlCol="0">
-                          <ns3:prstTxWarp prst="textNoShape">
-                            <ns3:avLst/>
-                          </ns3:prstTxWarp>
-                          <ns3:noAutofit/>
-                        </ns6:bodyPr>
-                      </ns6:wsp>
-                    </ns9:wgp>
-                  </ns3:graphicData>
-                </ns3:graphic>
-              </ns2:inline>
-            </ns0:drawing>
-          </ns1:Choice>
-          <ns1:Fallback>
-            <ns0:pict>
-              <ns7:group style="width:144.050pt;height:.6pt;mso-position-horizontal-relative:char;mso-position-vertical-relative:line" id="docshapegroup20" coordorigin="0,0" coordsize="2881,12">
-                <ns7:rect style="position:absolute;left:0;top:0;width:2881;height:12" id="docshape21" filled="true" fillcolor="#000000" stroked="false">
-                  <ns7:fill type="solid"/>
-                </ns7:rect>
-              </ns7:group>
-            </ns0:pict>
-          </ns1:Fallback>
-        </ns1:AlternateContent>
-      </ns0:r>
-      <ns0:r>
-        <ns0:rPr>
-          <ns0:sz ns0:val="2"/>
-        </ns0:rPr>
-      </ns0:r>
-    </ns0:p>
-    <ns0:p>
-      <ns0:pPr>
         <ns0:spacing ns0:before="95"/>
         <ns0:ind ns0:left="569" ns0:right="0" ns0:firstLine="0"/>
         <ns0:jc ns0:val="left"/>
@@ -6421,20 +6235,6 @@
         </ns0:rPr>
         <ns0:t> dân</ns0:t>
       </ns0:r>
-    </ns0:p>
-    <ns0:p>
-      <ns0:pPr>
-        <ns0:spacing ns0:after="0"/>
-        <ns0:jc ns0:val="left"/>
-        <ns0:rPr>
-          <ns0:sz ns0:val="20"/>
-        </ns0:rPr>
-        <ns0:sectPr>
-          <ns0:type ns0:val="continuous"/>
-          <ns0:pgSz ns0:w="11910" ns0:h="16840"/>
-          <ns0:pgMar ns0:header="585" ns0:footer="0" ns0:top="1040" ns0:bottom="280" ns0:left="1133" ns0:right="566"/>
-        </ns0:sectPr>
-      </ns0:pPr>
     </ns0:p>
     <ns0:p>
       <ns0:pPr>
@@ -6457,7 +6257,7 @@
         <ns0:rPr>
           <ns0:sz ns0:val="22"/>
         </ns0:rPr>
-        <ns0:t>Tiêm</ns0:t>
+        <ns0:t>b) Tiêm</ns0:t>
       </ns0:r>
       <ns0:r>
         <ns0:rPr>

</xml_diff>

<commit_message>
Fix tìm gói KSK trên His
</commit_message>
<xml_diff>
--- a/Mau02.docx
+++ b/Mau02.docx
@@ -1283,18 +1283,18 @@
         <mc:AlternateContent>
           <mc:Choice Requires="wps">
             <w:drawing>
-              <wp:anchor distT="0" distB="0" distL="114300" distR="114300" simplePos="0" relativeHeight="486651904" behindDoc="1" locked="0" layoutInCell="1" allowOverlap="1" wp14:anchorId="0C241481" wp14:editId="2AF9D5FF">
+              <wp:anchor distT="0" distB="0" distL="114300" distR="114300" simplePos="0" relativeHeight="487599104" behindDoc="0" locked="0" layoutInCell="1" allowOverlap="1" wp14:anchorId="22E84317" wp14:editId="76D922CC">
                 <wp:simplePos x="0" y="0"/>
                 <wp:positionH relativeFrom="page">
-                  <wp:posOffset>3368675</wp:posOffset>
+                  <wp:posOffset>4624070</wp:posOffset>
                 </wp:positionH>
                 <wp:positionV relativeFrom="paragraph">
-                  <wp:posOffset>17780</wp:posOffset>
+                  <wp:posOffset>14605</wp:posOffset>
                 </wp:positionV>
-                <wp:extent cx="1800225" cy="292735"/>
-                <wp:effectExtent l="0" t="0" r="0" b="0"/>
+                <wp:extent cx="130810" cy="130810"/>
+                <wp:effectExtent l="0" t="0" r="21590" b="21590"/>
                 <wp:wrapNone/>
-                <wp:docPr id="1047825172" name="docshape3"/>
+                <wp:docPr id="287130778" name="docshape4"/>
                 <wp:cNvGraphicFramePr>
                   <a:graphicFrameLocks xmlns:a="http://schemas.openxmlformats.org/drawingml/2006/main"/>
                 </wp:cNvGraphicFramePr>
@@ -1302,636 +1302,23 @@
                   <a:graphicData uri="http://schemas.microsoft.com/office/word/2010/wordprocessingShape">
                     <wps:wsp>
                       <wps:cNvSpPr>
-                        <a:spLocks/>
+                        <a:spLocks noChangeArrowheads="1"/>
                       </wps:cNvSpPr>
                       <wps:spPr bwMode="auto">
                         <a:xfrm>
                           <a:off x="0" y="0"/>
-                          <a:ext cx="1800225" cy="292735"/>
+                          <a:ext cx="130810" cy="130810"/>
                         </a:xfrm>
-                        <a:custGeom>
+                        <a:prstGeom prst="rect">
                           <a:avLst/>
-                          <a:gdLst>
-                            <a:gd name="T0" fmla="+- 0 5682 5305"/>
-                            <a:gd name="T1" fmla="*/ T0 w 2835"/>
-                            <a:gd name="T2" fmla="+- 0 234 28"/>
-                            <a:gd name="T3" fmla="*/ 234 h 461"/>
-                            <a:gd name="T4" fmla="+- 0 5475 5305"/>
-                            <a:gd name="T5" fmla="*/ T4 w 2835"/>
-                            <a:gd name="T6" fmla="+- 0 28 28"/>
-                            <a:gd name="T7" fmla="*/ 28 h 461"/>
-                            <a:gd name="T8" fmla="+- 0 5783 5305"/>
-                            <a:gd name="T9" fmla="*/ T8 w 2835"/>
-                            <a:gd name="T10" fmla="+- 0 234 28"/>
-                            <a:gd name="T11" fmla="*/ 234 h 461"/>
-                            <a:gd name="T12" fmla="+- 0 5989 5305"/>
-                            <a:gd name="T13" fmla="*/ T12 w 2835"/>
-                            <a:gd name="T14" fmla="+- 0 28 28"/>
-                            <a:gd name="T15" fmla="*/ 28 h 461"/>
-                            <a:gd name="T16" fmla="+- 0 5783 5305"/>
-                            <a:gd name="T17" fmla="*/ T16 w 2835"/>
-                            <a:gd name="T18" fmla="+- 0 234 28"/>
-                            <a:gd name="T19" fmla="*/ 234 h 461"/>
-                            <a:gd name="T20" fmla="+- 0 6296 5305"/>
-                            <a:gd name="T21" fmla="*/ T20 w 2835"/>
-                            <a:gd name="T22" fmla="+- 0 234 28"/>
-                            <a:gd name="T23" fmla="*/ 234 h 461"/>
-                            <a:gd name="T24" fmla="+- 0 6090 5305"/>
-                            <a:gd name="T25" fmla="*/ T24 w 2835"/>
-                            <a:gd name="T26" fmla="+- 0 28 28"/>
-                            <a:gd name="T27" fmla="*/ 28 h 461"/>
-                            <a:gd name="T28" fmla="+- 0 6397 5305"/>
-                            <a:gd name="T29" fmla="*/ T28 w 2835"/>
-                            <a:gd name="T30" fmla="+- 0 234 28"/>
-                            <a:gd name="T31" fmla="*/ 234 h 461"/>
-                            <a:gd name="T32" fmla="+- 0 6603 5305"/>
-                            <a:gd name="T33" fmla="*/ T32 w 2835"/>
-                            <a:gd name="T34" fmla="+- 0 28 28"/>
-                            <a:gd name="T35" fmla="*/ 28 h 461"/>
-                            <a:gd name="T36" fmla="+- 0 6397 5305"/>
-                            <a:gd name="T37" fmla="*/ T36 w 2835"/>
-                            <a:gd name="T38" fmla="+- 0 234 28"/>
-                            <a:gd name="T39" fmla="*/ 234 h 461"/>
-                            <a:gd name="T40" fmla="+- 0 6911 5305"/>
-                            <a:gd name="T41" fmla="*/ T40 w 2835"/>
-                            <a:gd name="T42" fmla="+- 0 234 28"/>
-                            <a:gd name="T43" fmla="*/ 234 h 461"/>
-                            <a:gd name="T44" fmla="+- 0 6705 5305"/>
-                            <a:gd name="T45" fmla="*/ T44 w 2835"/>
-                            <a:gd name="T46" fmla="+- 0 28 28"/>
-                            <a:gd name="T47" fmla="*/ 28 h 461"/>
-                            <a:gd name="T48" fmla="+- 0 7012 5305"/>
-                            <a:gd name="T49" fmla="*/ T48 w 2835"/>
-                            <a:gd name="T50" fmla="+- 0 234 28"/>
-                            <a:gd name="T51" fmla="*/ 234 h 461"/>
-                            <a:gd name="T52" fmla="+- 0 7218 5305"/>
-                            <a:gd name="T53" fmla="*/ T52 w 2835"/>
-                            <a:gd name="T54" fmla="+- 0 28 28"/>
-                            <a:gd name="T55" fmla="*/ 28 h 461"/>
-                            <a:gd name="T56" fmla="+- 0 7012 5305"/>
-                            <a:gd name="T57" fmla="*/ T56 w 2835"/>
-                            <a:gd name="T58" fmla="+- 0 234 28"/>
-                            <a:gd name="T59" fmla="*/ 234 h 461"/>
-                            <a:gd name="T60" fmla="+- 0 7525 5305"/>
-                            <a:gd name="T61" fmla="*/ T60 w 2835"/>
-                            <a:gd name="T62" fmla="+- 0 234 28"/>
-                            <a:gd name="T63" fmla="*/ 234 h 461"/>
-                            <a:gd name="T64" fmla="+- 0 7319 5305"/>
-                            <a:gd name="T65" fmla="*/ T64 w 2835"/>
-                            <a:gd name="T66" fmla="+- 0 28 28"/>
-                            <a:gd name="T67" fmla="*/ 28 h 461"/>
-                            <a:gd name="T68" fmla="+- 0 7626 5305"/>
-                            <a:gd name="T69" fmla="*/ T68 w 2835"/>
-                            <a:gd name="T70" fmla="+- 0 234 28"/>
-                            <a:gd name="T71" fmla="*/ 234 h 461"/>
-                            <a:gd name="T72" fmla="+- 0 7833 5305"/>
-                            <a:gd name="T73" fmla="*/ T72 w 2835"/>
-                            <a:gd name="T74" fmla="+- 0 28 28"/>
-                            <a:gd name="T75" fmla="*/ 28 h 461"/>
-                            <a:gd name="T76" fmla="+- 0 7626 5305"/>
-                            <a:gd name="T77" fmla="*/ T76 w 2835"/>
-                            <a:gd name="T78" fmla="+- 0 234 28"/>
-                            <a:gd name="T79" fmla="*/ 234 h 461"/>
-                            <a:gd name="T80" fmla="+- 0 8140 5305"/>
-                            <a:gd name="T81" fmla="*/ T80 w 2835"/>
-                            <a:gd name="T82" fmla="+- 0 234 28"/>
-                            <a:gd name="T83" fmla="*/ 234 h 461"/>
-                            <a:gd name="T84" fmla="+- 0 7933 5305"/>
-                            <a:gd name="T85" fmla="*/ T84 w 2835"/>
-                            <a:gd name="T86" fmla="+- 0 28 28"/>
-                            <a:gd name="T87" fmla="*/ 28 h 461"/>
-                            <a:gd name="T88" fmla="+- 0 5305 5305"/>
-                            <a:gd name="T89" fmla="*/ T88 w 2835"/>
-                            <a:gd name="T90" fmla="+- 0 488 28"/>
-                            <a:gd name="T91" fmla="*/ 488 h 461"/>
-                            <a:gd name="T92" fmla="+- 0 5511 5305"/>
-                            <a:gd name="T93" fmla="*/ T92 w 2835"/>
-                            <a:gd name="T94" fmla="+- 0 282 28"/>
-                            <a:gd name="T95" fmla="*/ 282 h 461"/>
-                            <a:gd name="T96" fmla="+- 0 5305 5305"/>
-                            <a:gd name="T97" fmla="*/ T96 w 2835"/>
-                            <a:gd name="T98" fmla="+- 0 488 28"/>
-                            <a:gd name="T99" fmla="*/ 488 h 461"/>
-                            <a:gd name="T100" fmla="+- 0 5816 5305"/>
-                            <a:gd name="T101" fmla="*/ T100 w 2835"/>
-                            <a:gd name="T102" fmla="+- 0 488 28"/>
-                            <a:gd name="T103" fmla="*/ 488 h 461"/>
-                            <a:gd name="T104" fmla="+- 0 5610 5305"/>
-                            <a:gd name="T105" fmla="*/ T104 w 2835"/>
-                            <a:gd name="T106" fmla="+- 0 282 28"/>
-                            <a:gd name="T107" fmla="*/ 282 h 461"/>
-                            <a:gd name="T108" fmla="+- 0 5917 5305"/>
-                            <a:gd name="T109" fmla="*/ T108 w 2835"/>
-                            <a:gd name="T110" fmla="+- 0 488 28"/>
-                            <a:gd name="T111" fmla="*/ 488 h 461"/>
-                            <a:gd name="T112" fmla="+- 0 6123 5305"/>
-                            <a:gd name="T113" fmla="*/ T112 w 2835"/>
-                            <a:gd name="T114" fmla="+- 0 282 28"/>
-                            <a:gd name="T115" fmla="*/ 282 h 461"/>
-                            <a:gd name="T116" fmla="+- 0 5917 5305"/>
-                            <a:gd name="T117" fmla="*/ T116 w 2835"/>
-                            <a:gd name="T118" fmla="+- 0 488 28"/>
-                            <a:gd name="T119" fmla="*/ 488 h 461"/>
-                            <a:gd name="T120" fmla="+- 0 6431 5305"/>
-                            <a:gd name="T121" fmla="*/ T120 w 2835"/>
-                            <a:gd name="T122" fmla="+- 0 488 28"/>
-                            <a:gd name="T123" fmla="*/ 488 h 461"/>
-                            <a:gd name="T124" fmla="+- 0 6224 5305"/>
-                            <a:gd name="T125" fmla="*/ T124 w 2835"/>
-                            <a:gd name="T126" fmla="+- 0 282 28"/>
-                            <a:gd name="T127" fmla="*/ 282 h 461"/>
-                            <a:gd name="T128" fmla="+- 0 6531 5305"/>
-                            <a:gd name="T129" fmla="*/ T128 w 2835"/>
-                            <a:gd name="T130" fmla="+- 0 488 28"/>
-                            <a:gd name="T131" fmla="*/ 488 h 461"/>
-                            <a:gd name="T132" fmla="+- 0 6738 5305"/>
-                            <a:gd name="T133" fmla="*/ T132 w 2835"/>
-                            <a:gd name="T134" fmla="+- 0 282 28"/>
-                            <a:gd name="T135" fmla="*/ 282 h 461"/>
-                            <a:gd name="T136" fmla="+- 0 6531 5305"/>
-                            <a:gd name="T137" fmla="*/ T136 w 2835"/>
-                            <a:gd name="T138" fmla="+- 0 488 28"/>
-                            <a:gd name="T139" fmla="*/ 488 h 461"/>
-                            <a:gd name="T140" fmla="+- 0 7045 5305"/>
-                            <a:gd name="T141" fmla="*/ T140 w 2835"/>
-                            <a:gd name="T142" fmla="+- 0 488 28"/>
-                            <a:gd name="T143" fmla="*/ 488 h 461"/>
-                            <a:gd name="T144" fmla="+- 0 6839 5305"/>
-                            <a:gd name="T145" fmla="*/ T144 w 2835"/>
-                            <a:gd name="T146" fmla="+- 0 282 28"/>
-                            <a:gd name="T147" fmla="*/ 282 h 461"/>
-                            <a:gd name="T148" fmla="+- 0 7146 5305"/>
-                            <a:gd name="T149" fmla="*/ T148 w 2835"/>
-                            <a:gd name="T150" fmla="+- 0 488 28"/>
-                            <a:gd name="T151" fmla="*/ 488 h 461"/>
-                            <a:gd name="T152" fmla="+- 0 7353 5305"/>
-                            <a:gd name="T153" fmla="*/ T152 w 2835"/>
-                            <a:gd name="T154" fmla="+- 0 282 28"/>
-                            <a:gd name="T155" fmla="*/ 282 h 461"/>
-                            <a:gd name="T156" fmla="+- 0 7146 5305"/>
-                            <a:gd name="T157" fmla="*/ T156 w 2835"/>
-                            <a:gd name="T158" fmla="+- 0 488 28"/>
-                            <a:gd name="T159" fmla="*/ 488 h 461"/>
-                            <a:gd name="T160" fmla="+- 0 7660 5305"/>
-                            <a:gd name="T161" fmla="*/ T160 w 2835"/>
-                            <a:gd name="T162" fmla="+- 0 488 28"/>
-                            <a:gd name="T163" fmla="*/ 488 h 461"/>
-                            <a:gd name="T164" fmla="+- 0 7453 5305"/>
-                            <a:gd name="T165" fmla="*/ T164 w 2835"/>
-                            <a:gd name="T166" fmla="+- 0 282 28"/>
-                            <a:gd name="T167" fmla="*/ 282 h 461"/>
-                            <a:gd name="T168" fmla="+- 0 7761 5305"/>
-                            <a:gd name="T169" fmla="*/ T168 w 2835"/>
-                            <a:gd name="T170" fmla="+- 0 488 28"/>
-                            <a:gd name="T171" fmla="*/ 488 h 461"/>
-                            <a:gd name="T172" fmla="+- 0 7967 5305"/>
-                            <a:gd name="T173" fmla="*/ T172 w 2835"/>
-                            <a:gd name="T174" fmla="+- 0 282 28"/>
-                            <a:gd name="T175" fmla="*/ 282 h 461"/>
-                            <a:gd name="T176" fmla="+- 0 7761 5305"/>
-                            <a:gd name="T177" fmla="*/ T176 w 2835"/>
-                            <a:gd name="T178" fmla="+- 0 488 28"/>
-                            <a:gd name="T179" fmla="*/ 488 h 461"/>
-                          </a:gdLst>
-                          <a:ahLst/>
-                          <a:cxnLst>
-                            <a:cxn ang="0">
-                              <a:pos x="T1" y="T3"/>
-                            </a:cxn>
-                            <a:cxn ang="0">
-                              <a:pos x="T5" y="T7"/>
-                            </a:cxn>
-                            <a:cxn ang="0">
-                              <a:pos x="T9" y="T11"/>
-                            </a:cxn>
-                            <a:cxn ang="0">
-                              <a:pos x="T13" y="T15"/>
-                            </a:cxn>
-                            <a:cxn ang="0">
-                              <a:pos x="T17" y="T19"/>
-                            </a:cxn>
-                            <a:cxn ang="0">
-                              <a:pos x="T21" y="T23"/>
-                            </a:cxn>
-                            <a:cxn ang="0">
-                              <a:pos x="T25" y="T27"/>
-                            </a:cxn>
-                            <a:cxn ang="0">
-                              <a:pos x="T29" y="T31"/>
-                            </a:cxn>
-                            <a:cxn ang="0">
-                              <a:pos x="T33" y="T35"/>
-                            </a:cxn>
-                            <a:cxn ang="0">
-                              <a:pos x="T37" y="T39"/>
-                            </a:cxn>
-                            <a:cxn ang="0">
-                              <a:pos x="T41" y="T43"/>
-                            </a:cxn>
-                            <a:cxn ang="0">
-                              <a:pos x="T45" y="T47"/>
-                            </a:cxn>
-                            <a:cxn ang="0">
-                              <a:pos x="T49" y="T51"/>
-                            </a:cxn>
-                            <a:cxn ang="0">
-                              <a:pos x="T53" y="T55"/>
-                            </a:cxn>
-                            <a:cxn ang="0">
-                              <a:pos x="T57" y="T59"/>
-                            </a:cxn>
-                            <a:cxn ang="0">
-                              <a:pos x="T61" y="T63"/>
-                            </a:cxn>
-                            <a:cxn ang="0">
-                              <a:pos x="T65" y="T67"/>
-                            </a:cxn>
-                            <a:cxn ang="0">
-                              <a:pos x="T69" y="T71"/>
-                            </a:cxn>
-                            <a:cxn ang="0">
-                              <a:pos x="T73" y="T75"/>
-                            </a:cxn>
-                            <a:cxn ang="0">
-                              <a:pos x="T77" y="T79"/>
-                            </a:cxn>
-                            <a:cxn ang="0">
-                              <a:pos x="T81" y="T83"/>
-                            </a:cxn>
-                            <a:cxn ang="0">
-                              <a:pos x="T85" y="T87"/>
-                            </a:cxn>
-                            <a:cxn ang="0">
-                              <a:pos x="T89" y="T91"/>
-                            </a:cxn>
-                            <a:cxn ang="0">
-                              <a:pos x="T93" y="T95"/>
-                            </a:cxn>
-                            <a:cxn ang="0">
-                              <a:pos x="T97" y="T99"/>
-                            </a:cxn>
-                            <a:cxn ang="0">
-                              <a:pos x="T101" y="T103"/>
-                            </a:cxn>
-                            <a:cxn ang="0">
-                              <a:pos x="T105" y="T107"/>
-                            </a:cxn>
-                            <a:cxn ang="0">
-                              <a:pos x="T109" y="T111"/>
-                            </a:cxn>
-                            <a:cxn ang="0">
-                              <a:pos x="T113" y="T115"/>
-                            </a:cxn>
-                            <a:cxn ang="0">
-                              <a:pos x="T117" y="T119"/>
-                            </a:cxn>
-                            <a:cxn ang="0">
-                              <a:pos x="T121" y="T123"/>
-                            </a:cxn>
-                            <a:cxn ang="0">
-                              <a:pos x="T125" y="T127"/>
-                            </a:cxn>
-                            <a:cxn ang="0">
-                              <a:pos x="T129" y="T131"/>
-                            </a:cxn>
-                            <a:cxn ang="0">
-                              <a:pos x="T133" y="T135"/>
-                            </a:cxn>
-                            <a:cxn ang="0">
-                              <a:pos x="T137" y="T139"/>
-                            </a:cxn>
-                            <a:cxn ang="0">
-                              <a:pos x="T141" y="T143"/>
-                            </a:cxn>
-                            <a:cxn ang="0">
-                              <a:pos x="T145" y="T147"/>
-                            </a:cxn>
-                            <a:cxn ang="0">
-                              <a:pos x="T149" y="T151"/>
-                            </a:cxn>
-                            <a:cxn ang="0">
-                              <a:pos x="T153" y="T155"/>
-                            </a:cxn>
-                            <a:cxn ang="0">
-                              <a:pos x="T157" y="T159"/>
-                            </a:cxn>
-                            <a:cxn ang="0">
-                              <a:pos x="T161" y="T163"/>
-                            </a:cxn>
-                            <a:cxn ang="0">
-                              <a:pos x="T165" y="T167"/>
-                            </a:cxn>
-                            <a:cxn ang="0">
-                              <a:pos x="T169" y="T171"/>
-                            </a:cxn>
-                            <a:cxn ang="0">
-                              <a:pos x="T173" y="T175"/>
-                            </a:cxn>
-                            <a:cxn ang="0">
-                              <a:pos x="T177" y="T179"/>
-                            </a:cxn>
-                          </a:cxnLst>
-                          <a:rect l="0" t="0" r="r" b="b"/>
-                          <a:pathLst>
-                            <a:path w="2835" h="461">
-                              <a:moveTo>
-                                <a:pt x="170" y="206"/>
-                              </a:moveTo>
-                              <a:lnTo>
-                                <a:pt x="377" y="206"/>
-                              </a:lnTo>
-                              <a:lnTo>
-                                <a:pt x="377" y="0"/>
-                              </a:lnTo>
-                              <a:lnTo>
-                                <a:pt x="170" y="0"/>
-                              </a:lnTo>
-                              <a:lnTo>
-                                <a:pt x="170" y="206"/>
-                              </a:lnTo>
-                              <a:close/>
-                              <a:moveTo>
-                                <a:pt x="478" y="206"/>
-                              </a:moveTo>
-                              <a:lnTo>
-                                <a:pt x="684" y="206"/>
-                              </a:lnTo>
-                              <a:lnTo>
-                                <a:pt x="684" y="0"/>
-                              </a:lnTo>
-                              <a:lnTo>
-                                <a:pt x="478" y="0"/>
-                              </a:lnTo>
-                              <a:lnTo>
-                                <a:pt x="478" y="206"/>
-                              </a:lnTo>
-                              <a:close/>
-                              <a:moveTo>
-                                <a:pt x="785" y="206"/>
-                              </a:moveTo>
-                              <a:lnTo>
-                                <a:pt x="991" y="206"/>
-                              </a:lnTo>
-                              <a:lnTo>
-                                <a:pt x="991" y="0"/>
-                              </a:lnTo>
-                              <a:lnTo>
-                                <a:pt x="785" y="0"/>
-                              </a:lnTo>
-                              <a:lnTo>
-                                <a:pt x="785" y="206"/>
-                              </a:lnTo>
-                              <a:close/>
-                              <a:moveTo>
-                                <a:pt x="1092" y="206"/>
-                              </a:moveTo>
-                              <a:lnTo>
-                                <a:pt x="1298" y="206"/>
-                              </a:lnTo>
-                              <a:lnTo>
-                                <a:pt x="1298" y="0"/>
-                              </a:lnTo>
-                              <a:lnTo>
-                                <a:pt x="1092" y="0"/>
-                              </a:lnTo>
-                              <a:lnTo>
-                                <a:pt x="1092" y="206"/>
-                              </a:lnTo>
-                              <a:close/>
-                              <a:moveTo>
-                                <a:pt x="1400" y="206"/>
-                              </a:moveTo>
-                              <a:lnTo>
-                                <a:pt x="1606" y="206"/>
-                              </a:lnTo>
-                              <a:lnTo>
-                                <a:pt x="1606" y="0"/>
-                              </a:lnTo>
-                              <a:lnTo>
-                                <a:pt x="1400" y="0"/>
-                              </a:lnTo>
-                              <a:lnTo>
-                                <a:pt x="1400" y="206"/>
-                              </a:lnTo>
-                              <a:close/>
-                              <a:moveTo>
-                                <a:pt x="1707" y="206"/>
-                              </a:moveTo>
-                              <a:lnTo>
-                                <a:pt x="1913" y="206"/>
-                              </a:lnTo>
-                              <a:lnTo>
-                                <a:pt x="1913" y="0"/>
-                              </a:lnTo>
-                              <a:lnTo>
-                                <a:pt x="1707" y="0"/>
-                              </a:lnTo>
-                              <a:lnTo>
-                                <a:pt x="1707" y="206"/>
-                              </a:lnTo>
-                              <a:close/>
-                              <a:moveTo>
-                                <a:pt x="2014" y="206"/>
-                              </a:moveTo>
-                              <a:lnTo>
-                                <a:pt x="2220" y="206"/>
-                              </a:lnTo>
-                              <a:lnTo>
-                                <a:pt x="2220" y="0"/>
-                              </a:lnTo>
-                              <a:lnTo>
-                                <a:pt x="2014" y="0"/>
-                              </a:lnTo>
-                              <a:lnTo>
-                                <a:pt x="2014" y="206"/>
-                              </a:lnTo>
-                              <a:close/>
-                              <a:moveTo>
-                                <a:pt x="2321" y="206"/>
-                              </a:moveTo>
-                              <a:lnTo>
-                                <a:pt x="2528" y="206"/>
-                              </a:lnTo>
-                              <a:lnTo>
-                                <a:pt x="2528" y="0"/>
-                              </a:lnTo>
-                              <a:lnTo>
-                                <a:pt x="2321" y="0"/>
-                              </a:lnTo>
-                              <a:lnTo>
-                                <a:pt x="2321" y="206"/>
-                              </a:lnTo>
-                              <a:close/>
-                              <a:moveTo>
-                                <a:pt x="2628" y="206"/>
-                              </a:moveTo>
-                              <a:lnTo>
-                                <a:pt x="2835" y="206"/>
-                              </a:lnTo>
-                              <a:lnTo>
-                                <a:pt x="2835" y="0"/>
-                              </a:lnTo>
-                              <a:lnTo>
-                                <a:pt x="2628" y="0"/>
-                              </a:lnTo>
-                              <a:lnTo>
-                                <a:pt x="2628" y="206"/>
-                              </a:lnTo>
-                              <a:close/>
-                              <a:moveTo>
-                                <a:pt x="0" y="460"/>
-                              </a:moveTo>
-                              <a:lnTo>
-                                <a:pt x="206" y="460"/>
-                              </a:lnTo>
-                              <a:lnTo>
-                                <a:pt x="206" y="254"/>
-                              </a:lnTo>
-                              <a:lnTo>
-                                <a:pt x="0" y="254"/>
-                              </a:lnTo>
-                              <a:lnTo>
-                                <a:pt x="0" y="460"/>
-                              </a:lnTo>
-                              <a:close/>
-                              <a:moveTo>
-                                <a:pt x="305" y="460"/>
-                              </a:moveTo>
-                              <a:lnTo>
-                                <a:pt x="511" y="460"/>
-                              </a:lnTo>
-                              <a:lnTo>
-                                <a:pt x="511" y="254"/>
-                              </a:lnTo>
-                              <a:lnTo>
-                                <a:pt x="305" y="254"/>
-                              </a:lnTo>
-                              <a:lnTo>
-                                <a:pt x="305" y="460"/>
-                              </a:lnTo>
-                              <a:close/>
-                              <a:moveTo>
-                                <a:pt x="612" y="460"/>
-                              </a:moveTo>
-                              <a:lnTo>
-                                <a:pt x="818" y="460"/>
-                              </a:lnTo>
-                              <a:lnTo>
-                                <a:pt x="818" y="254"/>
-                              </a:lnTo>
-                              <a:lnTo>
-                                <a:pt x="612" y="254"/>
-                              </a:lnTo>
-                              <a:lnTo>
-                                <a:pt x="612" y="460"/>
-                              </a:lnTo>
-                              <a:close/>
-                              <a:moveTo>
-                                <a:pt x="919" y="460"/>
-                              </a:moveTo>
-                              <a:lnTo>
-                                <a:pt x="1126" y="460"/>
-                              </a:lnTo>
-                              <a:lnTo>
-                                <a:pt x="1126" y="254"/>
-                              </a:lnTo>
-                              <a:lnTo>
-                                <a:pt x="919" y="254"/>
-                              </a:lnTo>
-                              <a:lnTo>
-                                <a:pt x="919" y="460"/>
-                              </a:lnTo>
-                              <a:close/>
-                              <a:moveTo>
-                                <a:pt x="1226" y="460"/>
-                              </a:moveTo>
-                              <a:lnTo>
-                                <a:pt x="1433" y="460"/>
-                              </a:lnTo>
-                              <a:lnTo>
-                                <a:pt x="1433" y="254"/>
-                              </a:lnTo>
-                              <a:lnTo>
-                                <a:pt x="1226" y="254"/>
-                              </a:lnTo>
-                              <a:lnTo>
-                                <a:pt x="1226" y="460"/>
-                              </a:lnTo>
-                              <a:close/>
-                              <a:moveTo>
-                                <a:pt x="1534" y="460"/>
-                              </a:moveTo>
-                              <a:lnTo>
-                                <a:pt x="1740" y="460"/>
-                              </a:lnTo>
-                              <a:lnTo>
-                                <a:pt x="1740" y="254"/>
-                              </a:lnTo>
-                              <a:lnTo>
-                                <a:pt x="1534" y="254"/>
-                              </a:lnTo>
-                              <a:lnTo>
-                                <a:pt x="1534" y="460"/>
-                              </a:lnTo>
-                              <a:close/>
-                              <a:moveTo>
-                                <a:pt x="1841" y="460"/>
-                              </a:moveTo>
-                              <a:lnTo>
-                                <a:pt x="2048" y="460"/>
-                              </a:lnTo>
-                              <a:lnTo>
-                                <a:pt x="2048" y="254"/>
-                              </a:lnTo>
-                              <a:lnTo>
-                                <a:pt x="1841" y="254"/>
-                              </a:lnTo>
-                              <a:lnTo>
-                                <a:pt x="1841" y="460"/>
-                              </a:lnTo>
-                              <a:close/>
-                              <a:moveTo>
-                                <a:pt x="2148" y="460"/>
-                              </a:moveTo>
-                              <a:lnTo>
-                                <a:pt x="2355" y="460"/>
-                              </a:lnTo>
-                              <a:lnTo>
-                                <a:pt x="2355" y="254"/>
-                              </a:lnTo>
-                              <a:lnTo>
-                                <a:pt x="2148" y="254"/>
-                              </a:lnTo>
-                              <a:lnTo>
-                                <a:pt x="2148" y="460"/>
-                              </a:lnTo>
-                              <a:close/>
-                              <a:moveTo>
-                                <a:pt x="2456" y="460"/>
-                              </a:moveTo>
-                              <a:lnTo>
-                                <a:pt x="2662" y="460"/>
-                              </a:lnTo>
-                              <a:lnTo>
-                                <a:pt x="2662" y="254"/>
-                              </a:lnTo>
-                              <a:lnTo>
-                                <a:pt x="2456" y="254"/>
-                              </a:lnTo>
-                              <a:lnTo>
-                                <a:pt x="2456" y="460"/>
-                              </a:lnTo>
-                              <a:close/>
-                            </a:path>
-                          </a:pathLst>
-                        </a:custGeom>
+                        </a:prstGeom>
                         <a:noFill/>
                         <a:ln w="9144">
                           <a:solidFill>
                             <a:srgbClr val="000000"/>
                           </a:solidFill>
                           <a:prstDash val="solid"/>
-                          <a:round/>
+                          <a:miter lim="800000"/>
                           <a:headEnd/>
                           <a:tailEnd/>
                         </a:ln>
@@ -1962,10 +1349,9 @@
           </mc:Choice>
           <mc:Fallback>
             <w:pict>
-              <v:shape w14:anchorId="2161604D" id="docshape3" o:spid="_x0000_s1026" style="position:absolute;margin-left:265.25pt;margin-top:1.4pt;width:141.75pt;height:23.05pt;z-index:-16664576;visibility:visible;mso-wrap-style:square;mso-width-percent:0;mso-height-percent:0;mso-wrap-distance-left:9pt;mso-wrap-distance-top:0;mso-wrap-distance-right:9pt;mso-wrap-distance-bottom:0;mso-position-horizontal:absolute;mso-position-horizontal-relative:page;mso-position-vertical:absolute;mso-position-vertical-relative:text;mso-width-percent:0;mso-height-percent:0;mso-width-relative:page;mso-height-relative:page;v-text-anchor:top" coordsize="2835,461" o:gfxdata="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" path="m170,206r207,l377,,170,r,206xm478,206r206,l684,,478,r,206xm785,206r206,l991,,785,r,206xm1092,206r206,l1298,,1092,r,206xm1400,206r206,l1606,,1400,r,206xm1707,206r206,l1913,,1707,r,206xm2014,206r206,l2220,,2014,r,206xm2321,206r207,l2528,,2321,r,206xm2628,206r207,l2835,,2628,r,206xm,460r206,l206,254,,254,,460xm305,460r206,l511,254r-206,l305,460xm612,460r206,l818,254r-206,l612,460xm919,460r207,l1126,254r-207,l919,460xm1226,460r207,l1433,254r-207,l1226,460xm1534,460r206,l1740,254r-206,l1534,460xm1841,460r207,l2048,254r-207,l1841,460xm2148,460r207,l2355,254r-207,l2148,460xm2456,460r206,l2662,254r-206,l2456,460xe" filled="f" strokeweight=".72pt">
-                <v:path arrowok="t" o:connecttype="custom" o:connectlocs="239395,148590;107950,17780;303530,148590;434340,17780;303530,148590;629285,148590;498475,17780;693420,148590;824230,17780;693420,148590;1019810,148590;889000,17780;1083945,148590;1214755,17780;1083945,148590;1409700,148590;1278890,17780;1473835,148590;1605280,17780;1473835,148590;1800225,148590;1668780,17780;0,309880;130810,179070;0,309880;324485,309880;193675,179070;388620,309880;519430,179070;388620,309880;715010,309880;583565,179070;778510,309880;909955,179070;778510,309880;1104900,309880;974090,179070;1169035,309880;1300480,179070;1169035,309880;1495425,309880;1363980,179070;1559560,309880;1690370,179070;1559560,309880" o:connectangles="0,0,0,0,0,0,0,0,0,0,0,0,0,0,0,0,0,0,0,0,0,0,0,0,0,0,0,0,0,0,0,0,0,0,0,0,0,0,0,0,0,0,0,0,0"/>
+              <v:rect w14:anchorId="7A168ED6" id="docshape4" o:spid="_x0000_s1026" style="position:absolute;margin-left:364.1pt;margin-top:1.15pt;width:10.3pt;height:10.3pt;z-index:487599104;visibility:visible;mso-wrap-style:square;mso-width-percent:0;mso-height-percent:0;mso-wrap-distance-left:9pt;mso-wrap-distance-top:0;mso-wrap-distance-right:9pt;mso-wrap-distance-bottom:0;mso-position-horizontal:absolute;mso-position-horizontal-relative:page;mso-position-vertical:absolute;mso-position-vertical-relative:text;mso-width-percent:0;mso-height-percent:0;mso-width-relative:page;mso-height-relative:page;v-text-anchor:top" o:gfxdata="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" filled="f" strokeweight=".72pt">
                 <w10:wrap anchorx="page"/>
-              </v:shape>
+              </v:rect>
             </w:pict>
           </mc:Fallback>
         </mc:AlternateContent>
@@ -1977,16 +1363,656 @@
         <mc:AlternateContent>
           <mc:Choice Requires="wps">
             <w:drawing>
-              <wp:anchor distT="0" distB="0" distL="114300" distR="114300" simplePos="0" relativeHeight="15730176" behindDoc="0" locked="0" layoutInCell="1" allowOverlap="1" wp14:anchorId="5F335268" wp14:editId="15C47289">
+              <wp:anchor distT="0" distB="0" distL="114300" distR="114300" simplePos="0" relativeHeight="487600128" behindDoc="0" locked="0" layoutInCell="1" allowOverlap="1" wp14:anchorId="39B12B9F" wp14:editId="0318E366">
                 <wp:simplePos x="0" y="0"/>
                 <wp:positionH relativeFrom="page">
-                  <wp:posOffset>5233035</wp:posOffset>
+                  <wp:posOffset>4822190</wp:posOffset>
                 </wp:positionH>
                 <wp:positionV relativeFrom="paragraph">
-                  <wp:posOffset>17780</wp:posOffset>
+                  <wp:posOffset>14605</wp:posOffset>
                 </wp:positionV>
                 <wp:extent cx="130810" cy="130810"/>
-                <wp:effectExtent l="0" t="0" r="0" b="0"/>
+                <wp:effectExtent l="0" t="0" r="21590" b="21590"/>
+                <wp:wrapNone/>
+                <wp:docPr id="2014282189" name="docshape5"/>
+                <wp:cNvGraphicFramePr>
+                  <a:graphicFrameLocks xmlns:a="http://schemas.openxmlformats.org/drawingml/2006/main"/>
+                </wp:cNvGraphicFramePr>
+                <a:graphic xmlns:a="http://schemas.openxmlformats.org/drawingml/2006/main">
+                  <a:graphicData uri="http://schemas.microsoft.com/office/word/2010/wordprocessingShape">
+                    <wps:wsp>
+                      <wps:cNvSpPr>
+                        <a:spLocks noChangeArrowheads="1"/>
+                      </wps:cNvSpPr>
+                      <wps:spPr bwMode="auto">
+                        <a:xfrm>
+                          <a:off x="0" y="0"/>
+                          <a:ext cx="130810" cy="130810"/>
+                        </a:xfrm>
+                        <a:prstGeom prst="rect">
+                          <a:avLst/>
+                        </a:prstGeom>
+                        <a:noFill/>
+                        <a:ln w="9144">
+                          <a:solidFill>
+                            <a:srgbClr val="000000"/>
+                          </a:solidFill>
+                          <a:prstDash val="solid"/>
+                          <a:miter lim="800000"/>
+                          <a:headEnd/>
+                          <a:tailEnd/>
+                        </a:ln>
+                        <a:extLst>
+                          <a:ext uri="{909E8E84-426E-40DD-AFC4-6F175D3DCCD1}">
+                            <a14:hiddenFill xmlns:a14="http://schemas.microsoft.com/office/drawing/2010/main">
+                              <a:solidFill>
+                                <a:srgbClr val="FFFFFF"/>
+                              </a:solidFill>
+                            </a14:hiddenFill>
+                          </a:ext>
+                        </a:extLst>
+                      </wps:spPr>
+                      <wps:bodyPr rot="0" vert="horz" wrap="square" lIns="91440" tIns="45720" rIns="91440" bIns="45720" anchor="t" anchorCtr="0" upright="1">
+                        <a:noAutofit/>
+                      </wps:bodyPr>
+                    </wps:wsp>
+                  </a:graphicData>
+                </a:graphic>
+                <wp14:sizeRelH relativeFrom="page">
+                  <wp14:pctWidth>0</wp14:pctWidth>
+                </wp14:sizeRelH>
+                <wp14:sizeRelV relativeFrom="page">
+                  <wp14:pctHeight>0</wp14:pctHeight>
+                </wp14:sizeRelV>
+              </wp:anchor>
+            </w:drawing>
+          </mc:Choice>
+          <mc:Fallback>
+            <w:pict>
+              <v:rect w14:anchorId="2C31CA4F" id="docshape5" o:spid="_x0000_s1026" style="position:absolute;margin-left:379.7pt;margin-top:1.15pt;width:10.3pt;height:10.3pt;z-index:487600128;visibility:visible;mso-wrap-style:square;mso-width-percent:0;mso-height-percent:0;mso-wrap-distance-left:9pt;mso-wrap-distance-top:0;mso-wrap-distance-right:9pt;mso-wrap-distance-bottom:0;mso-position-horizontal:absolute;mso-position-horizontal-relative:page;mso-position-vertical:absolute;mso-position-vertical-relative:text;mso-width-percent:0;mso-height-percent:0;mso-width-relative:page;mso-height-relative:page;v-text-anchor:top" o:gfxdata="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" filled="f" strokeweight=".72pt">
+                <w10:wrap anchorx="page"/>
+              </v:rect>
+            </w:pict>
+          </mc:Fallback>
+        </mc:AlternateContent>
+      </w:r>
+      <w:r>
+        <w:rPr>
+          <w:noProof/>
+        </w:rPr>
+        <mc:AlternateContent>
+          <mc:Choice Requires="wps">
+            <w:drawing>
+              <wp:anchor distT="0" distB="0" distL="114300" distR="114300" simplePos="0" relativeHeight="487601152" behindDoc="0" locked="0" layoutInCell="1" allowOverlap="1" wp14:anchorId="16C7E414" wp14:editId="6CD87A1F">
+                <wp:simplePos x="0" y="0"/>
+                <wp:positionH relativeFrom="page">
+                  <wp:posOffset>5019675</wp:posOffset>
+                </wp:positionH>
+                <wp:positionV relativeFrom="paragraph">
+                  <wp:posOffset>14605</wp:posOffset>
+                </wp:positionV>
+                <wp:extent cx="130810" cy="130810"/>
+                <wp:effectExtent l="0" t="0" r="21590" b="21590"/>
+                <wp:wrapNone/>
+                <wp:docPr id="984511104" name="docshape6"/>
+                <wp:cNvGraphicFramePr>
+                  <a:graphicFrameLocks xmlns:a="http://schemas.openxmlformats.org/drawingml/2006/main"/>
+                </wp:cNvGraphicFramePr>
+                <a:graphic xmlns:a="http://schemas.openxmlformats.org/drawingml/2006/main">
+                  <a:graphicData uri="http://schemas.microsoft.com/office/word/2010/wordprocessingShape">
+                    <wps:wsp>
+                      <wps:cNvSpPr>
+                        <a:spLocks noChangeArrowheads="1"/>
+                      </wps:cNvSpPr>
+                      <wps:spPr bwMode="auto">
+                        <a:xfrm>
+                          <a:off x="0" y="0"/>
+                          <a:ext cx="130810" cy="130810"/>
+                        </a:xfrm>
+                        <a:prstGeom prst="rect">
+                          <a:avLst/>
+                        </a:prstGeom>
+                        <a:noFill/>
+                        <a:ln w="9144">
+                          <a:solidFill>
+                            <a:srgbClr val="000000"/>
+                          </a:solidFill>
+                          <a:prstDash val="solid"/>
+                          <a:miter lim="800000"/>
+                          <a:headEnd/>
+                          <a:tailEnd/>
+                        </a:ln>
+                        <a:extLst>
+                          <a:ext uri="{909E8E84-426E-40DD-AFC4-6F175D3DCCD1}">
+                            <a14:hiddenFill xmlns:a14="http://schemas.microsoft.com/office/drawing/2010/main">
+                              <a:solidFill>
+                                <a:srgbClr val="FFFFFF"/>
+                              </a:solidFill>
+                            </a14:hiddenFill>
+                          </a:ext>
+                        </a:extLst>
+                      </wps:spPr>
+                      <wps:bodyPr rot="0" vert="horz" wrap="square" lIns="91440" tIns="45720" rIns="91440" bIns="45720" anchor="t" anchorCtr="0" upright="1">
+                        <a:noAutofit/>
+                      </wps:bodyPr>
+                    </wps:wsp>
+                  </a:graphicData>
+                </a:graphic>
+                <wp14:sizeRelH relativeFrom="page">
+                  <wp14:pctWidth>0</wp14:pctWidth>
+                </wp14:sizeRelH>
+                <wp14:sizeRelV relativeFrom="page">
+                  <wp14:pctHeight>0</wp14:pctHeight>
+                </wp14:sizeRelV>
+              </wp:anchor>
+            </w:drawing>
+          </mc:Choice>
+          <mc:Fallback>
+            <w:pict>
+              <v:rect w14:anchorId="7CC7CE07" id="docshape6" o:spid="_x0000_s1026" style="position:absolute;margin-left:395.25pt;margin-top:1.15pt;width:10.3pt;height:10.3pt;z-index:487601152;visibility:visible;mso-wrap-style:square;mso-width-percent:0;mso-height-percent:0;mso-wrap-distance-left:9pt;mso-wrap-distance-top:0;mso-wrap-distance-right:9pt;mso-wrap-distance-bottom:0;mso-position-horizontal:absolute;mso-position-horizontal-relative:page;mso-position-vertical:absolute;mso-position-vertical-relative:text;mso-width-percent:0;mso-height-percent:0;mso-width-relative:page;mso-height-relative:page;v-text-anchor:top" o:gfxdata="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" filled="f" strokeweight=".72pt">
+                <w10:wrap anchorx="page"/>
+              </v:rect>
+            </w:pict>
+          </mc:Fallback>
+        </mc:AlternateContent>
+      </w:r>
+      <w:r>
+        <w:rPr>
+          <w:noProof/>
+        </w:rPr>
+        <mc:AlternateContent>
+          <mc:Choice Requires="wps">
+            <w:drawing>
+              <wp:anchor distT="0" distB="0" distL="114300" distR="114300" simplePos="0" relativeHeight="487595008" behindDoc="0" locked="0" layoutInCell="1" allowOverlap="1" wp14:anchorId="2BDE87D5" wp14:editId="3FCD0CDD">
+                <wp:simplePos x="0" y="0"/>
+                <wp:positionH relativeFrom="page">
+                  <wp:posOffset>4025900</wp:posOffset>
+                </wp:positionH>
+                <wp:positionV relativeFrom="paragraph">
+                  <wp:posOffset>13970</wp:posOffset>
+                </wp:positionV>
+                <wp:extent cx="130810" cy="130810"/>
+                <wp:effectExtent l="0" t="0" r="21590" b="21590"/>
+                <wp:wrapNone/>
+                <wp:docPr id="356703002" name="docshape4"/>
+                <wp:cNvGraphicFramePr>
+                  <a:graphicFrameLocks xmlns:a="http://schemas.openxmlformats.org/drawingml/2006/main"/>
+                </wp:cNvGraphicFramePr>
+                <a:graphic xmlns:a="http://schemas.openxmlformats.org/drawingml/2006/main">
+                  <a:graphicData uri="http://schemas.microsoft.com/office/word/2010/wordprocessingShape">
+                    <wps:wsp>
+                      <wps:cNvSpPr>
+                        <a:spLocks noChangeArrowheads="1"/>
+                      </wps:cNvSpPr>
+                      <wps:spPr bwMode="auto">
+                        <a:xfrm>
+                          <a:off x="0" y="0"/>
+                          <a:ext cx="130810" cy="130810"/>
+                        </a:xfrm>
+                        <a:prstGeom prst="rect">
+                          <a:avLst/>
+                        </a:prstGeom>
+                        <a:noFill/>
+                        <a:ln w="9144">
+                          <a:solidFill>
+                            <a:srgbClr val="000000"/>
+                          </a:solidFill>
+                          <a:prstDash val="solid"/>
+                          <a:miter lim="800000"/>
+                          <a:headEnd/>
+                          <a:tailEnd/>
+                        </a:ln>
+                        <a:extLst>
+                          <a:ext uri="{909E8E84-426E-40DD-AFC4-6F175D3DCCD1}">
+                            <a14:hiddenFill xmlns:a14="http://schemas.microsoft.com/office/drawing/2010/main">
+                              <a:solidFill>
+                                <a:srgbClr val="FFFFFF"/>
+                              </a:solidFill>
+                            </a14:hiddenFill>
+                          </a:ext>
+                        </a:extLst>
+                      </wps:spPr>
+                      <wps:bodyPr rot="0" vert="horz" wrap="square" lIns="91440" tIns="45720" rIns="91440" bIns="45720" anchor="t" anchorCtr="0" upright="1">
+                        <a:noAutofit/>
+                      </wps:bodyPr>
+                    </wps:wsp>
+                  </a:graphicData>
+                </a:graphic>
+                <wp14:sizeRelH relativeFrom="page">
+                  <wp14:pctWidth>0</wp14:pctWidth>
+                </wp14:sizeRelH>
+                <wp14:sizeRelV relativeFrom="page">
+                  <wp14:pctHeight>0</wp14:pctHeight>
+                </wp14:sizeRelV>
+              </wp:anchor>
+            </w:drawing>
+          </mc:Choice>
+          <mc:Fallback>
+            <w:pict>
+              <v:rect w14:anchorId="14EB878C" id="docshape4" o:spid="_x0000_s1026" style="position:absolute;margin-left:317pt;margin-top:1.1pt;width:10.3pt;height:10.3pt;z-index:487595008;visibility:visible;mso-wrap-style:square;mso-width-percent:0;mso-height-percent:0;mso-wrap-distance-left:9pt;mso-wrap-distance-top:0;mso-wrap-distance-right:9pt;mso-wrap-distance-bottom:0;mso-position-horizontal:absolute;mso-position-horizontal-relative:page;mso-position-vertical:absolute;mso-position-vertical-relative:text;mso-width-percent:0;mso-height-percent:0;mso-width-relative:page;mso-height-relative:page;v-text-anchor:top" o:gfxdata="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" filled="f" strokeweight=".72pt">
+                <w10:wrap anchorx="page"/>
+              </v:rect>
+            </w:pict>
+          </mc:Fallback>
+        </mc:AlternateContent>
+      </w:r>
+      <w:r>
+        <w:rPr>
+          <w:noProof/>
+        </w:rPr>
+        <mc:AlternateContent>
+          <mc:Choice Requires="wps">
+            <w:drawing>
+              <wp:anchor distT="0" distB="0" distL="114300" distR="114300" simplePos="0" relativeHeight="487596032" behindDoc="0" locked="0" layoutInCell="1" allowOverlap="1" wp14:anchorId="0F569B6E" wp14:editId="38733DA5">
+                <wp:simplePos x="0" y="0"/>
+                <wp:positionH relativeFrom="page">
+                  <wp:posOffset>4224020</wp:posOffset>
+                </wp:positionH>
+                <wp:positionV relativeFrom="paragraph">
+                  <wp:posOffset>13970</wp:posOffset>
+                </wp:positionV>
+                <wp:extent cx="130810" cy="130810"/>
+                <wp:effectExtent l="0" t="0" r="21590" b="21590"/>
+                <wp:wrapNone/>
+                <wp:docPr id="751617717" name="docshape5"/>
+                <wp:cNvGraphicFramePr>
+                  <a:graphicFrameLocks xmlns:a="http://schemas.openxmlformats.org/drawingml/2006/main"/>
+                </wp:cNvGraphicFramePr>
+                <a:graphic xmlns:a="http://schemas.openxmlformats.org/drawingml/2006/main">
+                  <a:graphicData uri="http://schemas.microsoft.com/office/word/2010/wordprocessingShape">
+                    <wps:wsp>
+                      <wps:cNvSpPr>
+                        <a:spLocks noChangeArrowheads="1"/>
+                      </wps:cNvSpPr>
+                      <wps:spPr bwMode="auto">
+                        <a:xfrm>
+                          <a:off x="0" y="0"/>
+                          <a:ext cx="130810" cy="130810"/>
+                        </a:xfrm>
+                        <a:prstGeom prst="rect">
+                          <a:avLst/>
+                        </a:prstGeom>
+                        <a:noFill/>
+                        <a:ln w="9144">
+                          <a:solidFill>
+                            <a:srgbClr val="000000"/>
+                          </a:solidFill>
+                          <a:prstDash val="solid"/>
+                          <a:miter lim="800000"/>
+                          <a:headEnd/>
+                          <a:tailEnd/>
+                        </a:ln>
+                        <a:extLst>
+                          <a:ext uri="{909E8E84-426E-40DD-AFC4-6F175D3DCCD1}">
+                            <a14:hiddenFill xmlns:a14="http://schemas.microsoft.com/office/drawing/2010/main">
+                              <a:solidFill>
+                                <a:srgbClr val="FFFFFF"/>
+                              </a:solidFill>
+                            </a14:hiddenFill>
+                          </a:ext>
+                        </a:extLst>
+                      </wps:spPr>
+                      <wps:bodyPr rot="0" vert="horz" wrap="square" lIns="91440" tIns="45720" rIns="91440" bIns="45720" anchor="t" anchorCtr="0" upright="1">
+                        <a:noAutofit/>
+                      </wps:bodyPr>
+                    </wps:wsp>
+                  </a:graphicData>
+                </a:graphic>
+                <wp14:sizeRelH relativeFrom="page">
+                  <wp14:pctWidth>0</wp14:pctWidth>
+                </wp14:sizeRelH>
+                <wp14:sizeRelV relativeFrom="page">
+                  <wp14:pctHeight>0</wp14:pctHeight>
+                </wp14:sizeRelV>
+              </wp:anchor>
+            </w:drawing>
+          </mc:Choice>
+          <mc:Fallback>
+            <w:pict>
+              <v:rect w14:anchorId="3BBBD0F1" id="docshape5" o:spid="_x0000_s1026" style="position:absolute;margin-left:332.6pt;margin-top:1.1pt;width:10.3pt;height:10.3pt;z-index:487596032;visibility:visible;mso-wrap-style:square;mso-width-percent:0;mso-height-percent:0;mso-wrap-distance-left:9pt;mso-wrap-distance-top:0;mso-wrap-distance-right:9pt;mso-wrap-distance-bottom:0;mso-position-horizontal:absolute;mso-position-horizontal-relative:page;mso-position-vertical:absolute;mso-position-vertical-relative:text;mso-width-percent:0;mso-height-percent:0;mso-width-relative:page;mso-height-relative:page;v-text-anchor:top" o:gfxdata="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" filled="f" strokeweight=".72pt">
+                <w10:wrap anchorx="page"/>
+              </v:rect>
+            </w:pict>
+          </mc:Fallback>
+        </mc:AlternateContent>
+      </w:r>
+      <w:r>
+        <w:rPr>
+          <w:noProof/>
+        </w:rPr>
+        <mc:AlternateContent>
+          <mc:Choice Requires="wps">
+            <w:drawing>
+              <wp:anchor distT="0" distB="0" distL="114300" distR="114300" simplePos="0" relativeHeight="487597056" behindDoc="0" locked="0" layoutInCell="1" allowOverlap="1" wp14:anchorId="6C28A8F3" wp14:editId="3810C818">
+                <wp:simplePos x="0" y="0"/>
+                <wp:positionH relativeFrom="page">
+                  <wp:posOffset>4425950</wp:posOffset>
+                </wp:positionH>
+                <wp:positionV relativeFrom="paragraph">
+                  <wp:posOffset>13970</wp:posOffset>
+                </wp:positionV>
+                <wp:extent cx="130810" cy="130810"/>
+                <wp:effectExtent l="0" t="0" r="21590" b="21590"/>
+                <wp:wrapNone/>
+                <wp:docPr id="1676641360" name="docshape6"/>
+                <wp:cNvGraphicFramePr>
+                  <a:graphicFrameLocks xmlns:a="http://schemas.openxmlformats.org/drawingml/2006/main"/>
+                </wp:cNvGraphicFramePr>
+                <a:graphic xmlns:a="http://schemas.openxmlformats.org/drawingml/2006/main">
+                  <a:graphicData uri="http://schemas.microsoft.com/office/word/2010/wordprocessingShape">
+                    <wps:wsp>
+                      <wps:cNvSpPr>
+                        <a:spLocks noChangeArrowheads="1"/>
+                      </wps:cNvSpPr>
+                      <wps:spPr bwMode="auto">
+                        <a:xfrm>
+                          <a:off x="0" y="0"/>
+                          <a:ext cx="130810" cy="130810"/>
+                        </a:xfrm>
+                        <a:prstGeom prst="rect">
+                          <a:avLst/>
+                        </a:prstGeom>
+                        <a:noFill/>
+                        <a:ln w="9144">
+                          <a:solidFill>
+                            <a:srgbClr val="000000"/>
+                          </a:solidFill>
+                          <a:prstDash val="solid"/>
+                          <a:miter lim="800000"/>
+                          <a:headEnd/>
+                          <a:tailEnd/>
+                        </a:ln>
+                        <a:extLst>
+                          <a:ext uri="{909E8E84-426E-40DD-AFC4-6F175D3DCCD1}">
+                            <a14:hiddenFill xmlns:a14="http://schemas.microsoft.com/office/drawing/2010/main">
+                              <a:solidFill>
+                                <a:srgbClr val="FFFFFF"/>
+                              </a:solidFill>
+                            </a14:hiddenFill>
+                          </a:ext>
+                        </a:extLst>
+                      </wps:spPr>
+                      <wps:bodyPr rot="0" vert="horz" wrap="square" lIns="91440" tIns="45720" rIns="91440" bIns="45720" anchor="t" anchorCtr="0" upright="1">
+                        <a:noAutofit/>
+                      </wps:bodyPr>
+                    </wps:wsp>
+                  </a:graphicData>
+                </a:graphic>
+                <wp14:sizeRelH relativeFrom="page">
+                  <wp14:pctWidth>0</wp14:pctWidth>
+                </wp14:sizeRelH>
+                <wp14:sizeRelV relativeFrom="page">
+                  <wp14:pctHeight>0</wp14:pctHeight>
+                </wp14:sizeRelV>
+              </wp:anchor>
+            </w:drawing>
+          </mc:Choice>
+          <mc:Fallback>
+            <w:pict>
+              <v:rect w14:anchorId="7846D67D" id="docshape6" o:spid="_x0000_s1026" style="position:absolute;margin-left:348.5pt;margin-top:1.1pt;width:10.3pt;height:10.3pt;z-index:487597056;visibility:visible;mso-wrap-style:square;mso-width-percent:0;mso-height-percent:0;mso-wrap-distance-left:9pt;mso-wrap-distance-top:0;mso-wrap-distance-right:9pt;mso-wrap-distance-bottom:0;mso-position-horizontal:absolute;mso-position-horizontal-relative:page;mso-position-vertical:absolute;mso-position-vertical-relative:text;mso-width-percent:0;mso-height-percent:0;mso-width-relative:page;mso-height-relative:page;v-text-anchor:top" o:gfxdata="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" filled="f" strokeweight=".72pt">
+                <w10:wrap anchorx="page"/>
+              </v:rect>
+            </w:pict>
+          </mc:Fallback>
+        </mc:AlternateContent>
+      </w:r>
+      <w:r>
+        <w:rPr>
+          <w:noProof/>
+        </w:rPr>
+        <mc:AlternateContent>
+          <mc:Choice Requires="wps">
+            <w:drawing>
+              <wp:anchor distT="0" distB="0" distL="114300" distR="114300" simplePos="0" relativeHeight="487590912" behindDoc="0" locked="0" layoutInCell="1" allowOverlap="1" wp14:anchorId="5586BF5E" wp14:editId="0F067B9B">
+                <wp:simplePos x="0" y="0"/>
+                <wp:positionH relativeFrom="page">
+                  <wp:posOffset>3427095</wp:posOffset>
+                </wp:positionH>
+                <wp:positionV relativeFrom="paragraph">
+                  <wp:posOffset>13970</wp:posOffset>
+                </wp:positionV>
+                <wp:extent cx="130810" cy="130810"/>
+                <wp:effectExtent l="0" t="0" r="21590" b="21590"/>
+                <wp:wrapNone/>
+                <wp:docPr id="276266335" name="docshape4"/>
+                <wp:cNvGraphicFramePr>
+                  <a:graphicFrameLocks xmlns:a="http://schemas.openxmlformats.org/drawingml/2006/main"/>
+                </wp:cNvGraphicFramePr>
+                <a:graphic xmlns:a="http://schemas.openxmlformats.org/drawingml/2006/main">
+                  <a:graphicData uri="http://schemas.microsoft.com/office/word/2010/wordprocessingShape">
+                    <wps:wsp>
+                      <wps:cNvSpPr>
+                        <a:spLocks noChangeArrowheads="1"/>
+                      </wps:cNvSpPr>
+                      <wps:spPr bwMode="auto">
+                        <a:xfrm>
+                          <a:off x="0" y="0"/>
+                          <a:ext cx="130810" cy="130810"/>
+                        </a:xfrm>
+                        <a:prstGeom prst="rect">
+                          <a:avLst/>
+                        </a:prstGeom>
+                        <a:noFill/>
+                        <a:ln w="9144">
+                          <a:solidFill>
+                            <a:srgbClr val="000000"/>
+                          </a:solidFill>
+                          <a:prstDash val="solid"/>
+                          <a:miter lim="800000"/>
+                          <a:headEnd/>
+                          <a:tailEnd/>
+                        </a:ln>
+                        <a:extLst>
+                          <a:ext uri="{909E8E84-426E-40DD-AFC4-6F175D3DCCD1}">
+                            <a14:hiddenFill xmlns:a14="http://schemas.microsoft.com/office/drawing/2010/main">
+                              <a:solidFill>
+                                <a:srgbClr val="FFFFFF"/>
+                              </a:solidFill>
+                            </a14:hiddenFill>
+                          </a:ext>
+                        </a:extLst>
+                      </wps:spPr>
+                      <wps:bodyPr rot="0" vert="horz" wrap="square" lIns="91440" tIns="45720" rIns="91440" bIns="45720" anchor="t" anchorCtr="0" upright="1">
+                        <a:noAutofit/>
+                      </wps:bodyPr>
+                    </wps:wsp>
+                  </a:graphicData>
+                </a:graphic>
+                <wp14:sizeRelH relativeFrom="page">
+                  <wp14:pctWidth>0</wp14:pctWidth>
+                </wp14:sizeRelH>
+                <wp14:sizeRelV relativeFrom="page">
+                  <wp14:pctHeight>0</wp14:pctHeight>
+                </wp14:sizeRelV>
+              </wp:anchor>
+            </w:drawing>
+          </mc:Choice>
+          <mc:Fallback>
+            <w:pict>
+              <v:rect w14:anchorId="04AAA872" id="docshape4" o:spid="_x0000_s1026" style="position:absolute;margin-left:269.85pt;margin-top:1.1pt;width:10.3pt;height:10.3pt;z-index:487590912;visibility:visible;mso-wrap-style:square;mso-width-percent:0;mso-height-percent:0;mso-wrap-distance-left:9pt;mso-wrap-distance-top:0;mso-wrap-distance-right:9pt;mso-wrap-distance-bottom:0;mso-position-horizontal:absolute;mso-position-horizontal-relative:page;mso-position-vertical:absolute;mso-position-vertical-relative:text;mso-width-percent:0;mso-height-percent:0;mso-width-relative:page;mso-height-relative:page;v-text-anchor:top" o:gfxdata="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" filled="f" strokeweight=".72pt">
+                <w10:wrap anchorx="page"/>
+              </v:rect>
+            </w:pict>
+          </mc:Fallback>
+        </mc:AlternateContent>
+      </w:r>
+      <w:r>
+        <w:rPr>
+          <w:noProof/>
+        </w:rPr>
+        <mc:AlternateContent>
+          <mc:Choice Requires="wps">
+            <w:drawing>
+              <wp:anchor distT="0" distB="0" distL="114300" distR="114300" simplePos="0" relativeHeight="487591936" behindDoc="0" locked="0" layoutInCell="1" allowOverlap="1" wp14:anchorId="154A70D6" wp14:editId="25F84072">
+                <wp:simplePos x="0" y="0"/>
+                <wp:positionH relativeFrom="page">
+                  <wp:posOffset>3625850</wp:posOffset>
+                </wp:positionH>
+                <wp:positionV relativeFrom="paragraph">
+                  <wp:posOffset>13970</wp:posOffset>
+                </wp:positionV>
+                <wp:extent cx="130810" cy="130810"/>
+                <wp:effectExtent l="0" t="0" r="21590" b="21590"/>
+                <wp:wrapNone/>
+                <wp:docPr id="39099277" name="docshape5"/>
+                <wp:cNvGraphicFramePr>
+                  <a:graphicFrameLocks xmlns:a="http://schemas.openxmlformats.org/drawingml/2006/main"/>
+                </wp:cNvGraphicFramePr>
+                <a:graphic xmlns:a="http://schemas.openxmlformats.org/drawingml/2006/main">
+                  <a:graphicData uri="http://schemas.microsoft.com/office/word/2010/wordprocessingShape">
+                    <wps:wsp>
+                      <wps:cNvSpPr>
+                        <a:spLocks noChangeArrowheads="1"/>
+                      </wps:cNvSpPr>
+                      <wps:spPr bwMode="auto">
+                        <a:xfrm>
+                          <a:off x="0" y="0"/>
+                          <a:ext cx="130810" cy="130810"/>
+                        </a:xfrm>
+                        <a:prstGeom prst="rect">
+                          <a:avLst/>
+                        </a:prstGeom>
+                        <a:noFill/>
+                        <a:ln w="9144">
+                          <a:solidFill>
+                            <a:srgbClr val="000000"/>
+                          </a:solidFill>
+                          <a:prstDash val="solid"/>
+                          <a:miter lim="800000"/>
+                          <a:headEnd/>
+                          <a:tailEnd/>
+                        </a:ln>
+                        <a:extLst>
+                          <a:ext uri="{909E8E84-426E-40DD-AFC4-6F175D3DCCD1}">
+                            <a14:hiddenFill xmlns:a14="http://schemas.microsoft.com/office/drawing/2010/main">
+                              <a:solidFill>
+                                <a:srgbClr val="FFFFFF"/>
+                              </a:solidFill>
+                            </a14:hiddenFill>
+                          </a:ext>
+                        </a:extLst>
+                      </wps:spPr>
+                      <wps:bodyPr rot="0" vert="horz" wrap="square" lIns="91440" tIns="45720" rIns="91440" bIns="45720" anchor="t" anchorCtr="0" upright="1">
+                        <a:noAutofit/>
+                      </wps:bodyPr>
+                    </wps:wsp>
+                  </a:graphicData>
+                </a:graphic>
+                <wp14:sizeRelH relativeFrom="page">
+                  <wp14:pctWidth>0</wp14:pctWidth>
+                </wp14:sizeRelH>
+                <wp14:sizeRelV relativeFrom="page">
+                  <wp14:pctHeight>0</wp14:pctHeight>
+                </wp14:sizeRelV>
+              </wp:anchor>
+            </w:drawing>
+          </mc:Choice>
+          <mc:Fallback>
+            <w:pict>
+              <v:rect w14:anchorId="06AD764A" id="docshape5" o:spid="_x0000_s1026" style="position:absolute;margin-left:285.5pt;margin-top:1.1pt;width:10.3pt;height:10.3pt;z-index:487591936;visibility:visible;mso-wrap-style:square;mso-width-percent:0;mso-height-percent:0;mso-wrap-distance-left:9pt;mso-wrap-distance-top:0;mso-wrap-distance-right:9pt;mso-wrap-distance-bottom:0;mso-position-horizontal:absolute;mso-position-horizontal-relative:page;mso-position-vertical:absolute;mso-position-vertical-relative:text;mso-width-percent:0;mso-height-percent:0;mso-width-relative:page;mso-height-relative:page;v-text-anchor:top" o:gfxdata="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" filled="f" strokeweight=".72pt">
+                <w10:wrap anchorx="page"/>
+              </v:rect>
+            </w:pict>
+          </mc:Fallback>
+        </mc:AlternateContent>
+      </w:r>
+      <w:r>
+        <w:rPr>
+          <w:noProof/>
+        </w:rPr>
+        <mc:AlternateContent>
+          <mc:Choice Requires="wps">
+            <w:drawing>
+              <wp:anchor distT="0" distB="0" distL="114300" distR="114300" simplePos="0" relativeHeight="487592960" behindDoc="0" locked="0" layoutInCell="1" allowOverlap="1" wp14:anchorId="5DA440E6" wp14:editId="06C09A9D">
+                <wp:simplePos x="0" y="0"/>
+                <wp:positionH relativeFrom="page">
+                  <wp:posOffset>3827780</wp:posOffset>
+                </wp:positionH>
+                <wp:positionV relativeFrom="paragraph">
+                  <wp:posOffset>13970</wp:posOffset>
+                </wp:positionV>
+                <wp:extent cx="130810" cy="130810"/>
+                <wp:effectExtent l="0" t="0" r="21590" b="21590"/>
+                <wp:wrapNone/>
+                <wp:docPr id="1476829902" name="docshape6"/>
+                <wp:cNvGraphicFramePr>
+                  <a:graphicFrameLocks xmlns:a="http://schemas.openxmlformats.org/drawingml/2006/main"/>
+                </wp:cNvGraphicFramePr>
+                <a:graphic xmlns:a="http://schemas.openxmlformats.org/drawingml/2006/main">
+                  <a:graphicData uri="http://schemas.microsoft.com/office/word/2010/wordprocessingShape">
+                    <wps:wsp>
+                      <wps:cNvSpPr>
+                        <a:spLocks noChangeArrowheads="1"/>
+                      </wps:cNvSpPr>
+                      <wps:spPr bwMode="auto">
+                        <a:xfrm>
+                          <a:off x="0" y="0"/>
+                          <a:ext cx="130810" cy="130810"/>
+                        </a:xfrm>
+                        <a:prstGeom prst="rect">
+                          <a:avLst/>
+                        </a:prstGeom>
+                        <a:noFill/>
+                        <a:ln w="9144">
+                          <a:solidFill>
+                            <a:srgbClr val="000000"/>
+                          </a:solidFill>
+                          <a:prstDash val="solid"/>
+                          <a:miter lim="800000"/>
+                          <a:headEnd/>
+                          <a:tailEnd/>
+                        </a:ln>
+                        <a:extLst>
+                          <a:ext uri="{909E8E84-426E-40DD-AFC4-6F175D3DCCD1}">
+                            <a14:hiddenFill xmlns:a14="http://schemas.microsoft.com/office/drawing/2010/main">
+                              <a:solidFill>
+                                <a:srgbClr val="FFFFFF"/>
+                              </a:solidFill>
+                            </a14:hiddenFill>
+                          </a:ext>
+                        </a:extLst>
+                      </wps:spPr>
+                      <wps:bodyPr rot="0" vert="horz" wrap="square" lIns="91440" tIns="45720" rIns="91440" bIns="45720" anchor="t" anchorCtr="0" upright="1">
+                        <a:noAutofit/>
+                      </wps:bodyPr>
+                    </wps:wsp>
+                  </a:graphicData>
+                </a:graphic>
+                <wp14:sizeRelH relativeFrom="page">
+                  <wp14:pctWidth>0</wp14:pctWidth>
+                </wp14:sizeRelH>
+                <wp14:sizeRelV relativeFrom="page">
+                  <wp14:pctHeight>0</wp14:pctHeight>
+                </wp14:sizeRelV>
+              </wp:anchor>
+            </w:drawing>
+          </mc:Choice>
+          <mc:Fallback>
+            <w:pict>
+              <v:rect w14:anchorId="1CC37BEA" id="docshape6" o:spid="_x0000_s1026" style="position:absolute;margin-left:301.4pt;margin-top:1.1pt;width:10.3pt;height:10.3pt;z-index:487592960;visibility:visible;mso-wrap-style:square;mso-width-percent:0;mso-height-percent:0;mso-wrap-distance-left:9pt;mso-wrap-distance-top:0;mso-wrap-distance-right:9pt;mso-wrap-distance-bottom:0;mso-position-horizontal:absolute;mso-position-horizontal-relative:page;mso-position-vertical:absolute;mso-position-vertical-relative:text;mso-width-percent:0;mso-height-percent:0;mso-width-relative:page;mso-height-relative:page;v-text-anchor:top" o:gfxdata="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" filled="f" strokeweight=".72pt">
+                <w10:wrap anchorx="page"/>
+              </v:rect>
+            </w:pict>
+          </mc:Fallback>
+        </mc:AlternateContent>
+      </w:r>
+      <w:r>
+        <w:rPr>
+          <w:noProof/>
+        </w:rPr>
+        <mc:AlternateContent>
+          <mc:Choice Requires="wps">
+            <w:drawing>
+              <wp:anchor distT="0" distB="0" distL="114300" distR="114300" simplePos="0" relativeHeight="15730176" behindDoc="0" locked="0" layoutInCell="1" allowOverlap="1" wp14:anchorId="5F335268" wp14:editId="47D1EEB3">
+                <wp:simplePos x="0" y="0"/>
+                <wp:positionH relativeFrom="page">
+                  <wp:posOffset>5219065</wp:posOffset>
+                </wp:positionH>
+                <wp:positionV relativeFrom="paragraph">
+                  <wp:posOffset>12700</wp:posOffset>
+                </wp:positionV>
+                <wp:extent cx="130810" cy="130810"/>
+                <wp:effectExtent l="0" t="0" r="21590" b="21590"/>
                 <wp:wrapNone/>
                 <wp:docPr id="472644413" name="docshape4"/>
                 <wp:cNvGraphicFramePr>
@@ -2043,7 +2069,7 @@
           </mc:Choice>
           <mc:Fallback>
             <w:pict>
-              <v:rect w14:anchorId="7351D637" id="docshape4" o:spid="_x0000_s1026" style="position:absolute;margin-left:412.05pt;margin-top:1.4pt;width:10.3pt;height:10.3pt;z-index:15730176;visibility:visible;mso-wrap-style:square;mso-width-percent:0;mso-height-percent:0;mso-wrap-distance-left:9pt;mso-wrap-distance-top:0;mso-wrap-distance-right:9pt;mso-wrap-distance-bottom:0;mso-position-horizontal:absolute;mso-position-horizontal-relative:page;mso-position-vertical:absolute;mso-position-vertical-relative:text;mso-width-percent:0;mso-height-percent:0;mso-width-relative:page;mso-height-relative:page;v-text-anchor:top" o:gfxdata="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" filled="f" strokeweight=".72pt">
+              <v:rect w14:anchorId="0AE10889" id="docshape4" o:spid="_x0000_s1026" style="position:absolute;margin-left:410.95pt;margin-top:1pt;width:10.3pt;height:10.3pt;z-index:15730176;visibility:visible;mso-wrap-style:square;mso-width-percent:0;mso-height-percent:0;mso-wrap-distance-left:9pt;mso-wrap-distance-top:0;mso-wrap-distance-right:9pt;mso-wrap-distance-bottom:0;mso-position-horizontal:absolute;mso-position-horizontal-relative:page;mso-position-vertical:absolute;mso-position-vertical-relative:text;mso-width-percent:0;mso-height-percent:0;mso-width-relative:page;mso-height-relative:page;v-text-anchor:top" o:gfxdata="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" filled="f" strokeweight=".72pt">
                 <w10:wrap anchorx="page"/>
               </v:rect>
             </w:pict>
@@ -2057,16 +2083,16 @@
         <mc:AlternateContent>
           <mc:Choice Requires="wps">
             <w:drawing>
-              <wp:anchor distT="0" distB="0" distL="114300" distR="114300" simplePos="0" relativeHeight="15730688" behindDoc="0" locked="0" layoutInCell="1" allowOverlap="1" wp14:anchorId="4EED4CCD" wp14:editId="5AF3CCD3">
+              <wp:anchor distT="0" distB="0" distL="114300" distR="114300" simplePos="0" relativeHeight="15730688" behindDoc="0" locked="0" layoutInCell="1" allowOverlap="1" wp14:anchorId="4EED4CCD" wp14:editId="5BBF281C">
                 <wp:simplePos x="0" y="0"/>
                 <wp:positionH relativeFrom="page">
-                  <wp:posOffset>5427980</wp:posOffset>
+                  <wp:posOffset>5422265</wp:posOffset>
                 </wp:positionH>
                 <wp:positionV relativeFrom="paragraph">
-                  <wp:posOffset>17780</wp:posOffset>
+                  <wp:posOffset>12700</wp:posOffset>
                 </wp:positionV>
                 <wp:extent cx="130810" cy="130810"/>
-                <wp:effectExtent l="0" t="0" r="0" b="0"/>
+                <wp:effectExtent l="0" t="0" r="21590" b="21590"/>
                 <wp:wrapNone/>
                 <wp:docPr id="2010350264" name="docshape5"/>
                 <wp:cNvGraphicFramePr>
@@ -2123,7 +2149,7 @@
           </mc:Choice>
           <mc:Fallback>
             <w:pict>
-              <v:rect w14:anchorId="660EF821" id="docshape5" o:spid="_x0000_s1026" style="position:absolute;margin-left:427.4pt;margin-top:1.4pt;width:10.3pt;height:10.3pt;z-index:15730688;visibility:visible;mso-wrap-style:square;mso-width-percent:0;mso-height-percent:0;mso-wrap-distance-left:9pt;mso-wrap-distance-top:0;mso-wrap-distance-right:9pt;mso-wrap-distance-bottom:0;mso-position-horizontal:absolute;mso-position-horizontal-relative:page;mso-position-vertical:absolute;mso-position-vertical-relative:text;mso-width-percent:0;mso-height-percent:0;mso-width-relative:page;mso-height-relative:page;v-text-anchor:top" o:gfxdata="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" filled="f" strokeweight=".72pt">
+              <v:rect w14:anchorId="35AC73D2" id="docshape5" o:spid="_x0000_s1026" style="position:absolute;margin-left:426.95pt;margin-top:1pt;width:10.3pt;height:10.3pt;z-index:15730688;visibility:visible;mso-wrap-style:square;mso-width-percent:0;mso-height-percent:0;mso-wrap-distance-left:9pt;mso-wrap-distance-top:0;mso-wrap-distance-right:9pt;mso-wrap-distance-bottom:0;mso-position-horizontal:absolute;mso-position-horizontal-relative:page;mso-position-vertical:absolute;mso-position-vertical-relative:text;mso-width-percent:0;mso-height-percent:0;mso-width-relative:page;mso-height-relative:page;v-text-anchor:top" o:gfxdata="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" filled="f" strokeweight=".72pt">
                 <w10:wrap anchorx="page"/>
               </v:rect>
             </w:pict>
@@ -2137,16 +2163,16 @@
         <mc:AlternateContent>
           <mc:Choice Requires="wps">
             <w:drawing>
-              <wp:anchor distT="0" distB="0" distL="114300" distR="114300" simplePos="0" relativeHeight="15731200" behindDoc="0" locked="0" layoutInCell="1" allowOverlap="1" wp14:anchorId="00A83955" wp14:editId="56896735">
+              <wp:anchor distT="0" distB="0" distL="114300" distR="114300" simplePos="0" relativeHeight="15731200" behindDoc="0" locked="0" layoutInCell="1" allowOverlap="1" wp14:anchorId="00A83955" wp14:editId="4F72A744">
                 <wp:simplePos x="0" y="0"/>
                 <wp:positionH relativeFrom="page">
-                  <wp:posOffset>5621655</wp:posOffset>
+                  <wp:posOffset>5619750</wp:posOffset>
                 </wp:positionH>
                 <wp:positionV relativeFrom="paragraph">
-                  <wp:posOffset>17780</wp:posOffset>
+                  <wp:posOffset>12700</wp:posOffset>
                 </wp:positionV>
                 <wp:extent cx="130810" cy="130810"/>
-                <wp:effectExtent l="0" t="0" r="0" b="0"/>
+                <wp:effectExtent l="0" t="0" r="21590" b="21590"/>
                 <wp:wrapNone/>
                 <wp:docPr id="1132805221" name="docshape6"/>
                 <wp:cNvGraphicFramePr>
@@ -2203,7 +2229,7 @@
           </mc:Choice>
           <mc:Fallback>
             <w:pict>
-              <v:rect w14:anchorId="2F728ACB" id="docshape6" o:spid="_x0000_s1026" style="position:absolute;margin-left:442.65pt;margin-top:1.4pt;width:10.3pt;height:10.3pt;z-index:15731200;visibility:visible;mso-wrap-style:square;mso-width-percent:0;mso-height-percent:0;mso-wrap-distance-left:9pt;mso-wrap-distance-top:0;mso-wrap-distance-right:9pt;mso-wrap-distance-bottom:0;mso-position-horizontal:absolute;mso-position-horizontal-relative:page;mso-position-vertical:absolute;mso-position-vertical-relative:text;mso-width-percent:0;mso-height-percent:0;mso-width-relative:page;mso-height-relative:page;v-text-anchor:top" o:gfxdata="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" filled="f" strokeweight=".72pt">
+              <v:rect w14:anchorId="18AA8C86" id="docshape6" o:spid="_x0000_s1026" style="position:absolute;margin-left:442.5pt;margin-top:1pt;width:10.3pt;height:10.3pt;z-index:15731200;visibility:visible;mso-wrap-style:square;mso-width-percent:0;mso-height-percent:0;mso-wrap-distance-left:9pt;mso-wrap-distance-top:0;mso-wrap-distance-right:9pt;mso-wrap-distance-bottom:0;mso-position-horizontal:absolute;mso-position-horizontal-relative:page;mso-position-vertical:absolute;mso-position-vertical-relative:text;mso-width-percent:0;mso-height-percent:0;mso-width-relative:page;mso-height-relative:page;v-text-anchor:top" o:gfxdata="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" filled="f" strokeweight=".72pt">
                 <w10:wrap anchorx="page"/>
               </v:rect>
             </w:pict>
@@ -2272,9 +2298,54 @@
       </w:hyperlink>
       <w:r>
         <w:rPr>
+          <w:rFonts w:ascii="Consolas" w:hAnsi="Consolas"/>
           <w:spacing w:val="-2"/>
         </w:rPr>
         <w:t>:</w:t>
+      </w:r>
+      <w:r>
+        <w:rPr>
+          <w:rFonts w:ascii="Consolas" w:hAnsi="Consolas"/>
+          <w:spacing w:val="-2"/>
+          <w:lang w:val="en-US"/>
+        </w:rPr>
+        <w:t xml:space="preserve">  </w:t>
+      </w:r>
+      <w:r>
+        <w:rPr>
+          <w:rFonts w:ascii="Consolas" w:hAnsi="Consolas"/>
+          <w:spacing w:val="-2"/>
+        </w:rPr>
+        <w:fldChar w:fldCharType="begin"/>
+      </w:r>
+      <w:r>
+        <w:rPr>
+          <w:rFonts w:ascii="Consolas" w:hAnsi="Consolas"/>
+          <w:spacing w:val="-2"/>
+        </w:rPr>
+        <w:instrText xml:space="preserve"> MERGEFIELD CCCD </w:instrText>
+      </w:r>
+      <w:r>
+        <w:rPr>
+          <w:rFonts w:ascii="Consolas" w:hAnsi="Consolas"/>
+          <w:spacing w:val="-2"/>
+        </w:rPr>
+        <w:fldChar w:fldCharType="separate"/>
+      </w:r>
+      <w:r>
+        <w:rPr>
+          <w:rFonts w:ascii="Consolas" w:hAnsi="Consolas"/>
+          <w:noProof/>
+          <w:spacing w:val="-2"/>
+        </w:rPr>
+        <w:t>«CCCD»</w:t>
+      </w:r>
+      <w:r>
+        <w:rPr>
+          <w:rFonts w:ascii="Consolas" w:hAnsi="Consolas"/>
+          <w:spacing w:val="-2"/>
+        </w:rPr>
+        <w:fldChar w:fldCharType="end"/>
       </w:r>
     </w:p>
     <w:p>
@@ -2296,7 +2367,7 @@
         <mc:AlternateContent>
           <mc:Choice Requires="wps">
             <w:drawing>
-              <wp:anchor distT="0" distB="0" distL="114300" distR="114300" simplePos="0" relativeHeight="15731712" behindDoc="0" locked="0" layoutInCell="1" allowOverlap="1" wp14:anchorId="50AC11B9" wp14:editId="23B157BF">
+              <wp:anchor distT="0" distB="0" distL="114300" distR="114300" simplePos="0" relativeHeight="15731712" behindDoc="0" locked="0" layoutInCell="1" allowOverlap="1" wp14:anchorId="50AC11B9" wp14:editId="7F05786E">
                 <wp:simplePos x="0" y="0"/>
                 <wp:positionH relativeFrom="page">
                   <wp:posOffset>2783205</wp:posOffset>
@@ -2362,7 +2433,7 @@
           </mc:Choice>
           <mc:Fallback>
             <w:pict>
-              <v:rect w14:anchorId="6135B62A" id="docshape7" o:spid="_x0000_s1026" style="position:absolute;margin-left:219.15pt;margin-top:1.5pt;width:10.3pt;height:10.3pt;z-index:15731712;visibility:visible;mso-wrap-style:square;mso-width-percent:0;mso-height-percent:0;mso-wrap-distance-left:9pt;mso-wrap-distance-top:0;mso-wrap-distance-right:9pt;mso-wrap-distance-bottom:0;mso-position-horizontal:absolute;mso-position-horizontal-relative:page;mso-position-vertical:absolute;mso-position-vertical-relative:text;mso-width-percent:0;mso-height-percent:0;mso-width-relative:page;mso-height-relative:page;v-text-anchor:top" o:gfxdata="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" filled="f" strokeweight=".72pt">
+              <v:rect w14:anchorId="4EBEEA59" id="docshape7" o:spid="_x0000_s1026" style="position:absolute;margin-left:219.15pt;margin-top:1.5pt;width:10.3pt;height:10.3pt;z-index:15731712;visibility:visible;mso-wrap-style:square;mso-width-percent:0;mso-height-percent:0;mso-wrap-distance-left:9pt;mso-wrap-distance-top:0;mso-wrap-distance-right:9pt;mso-wrap-distance-bottom:0;mso-position-horizontal:absolute;mso-position-horizontal-relative:page;mso-position-vertical:absolute;mso-position-vertical-relative:text;mso-width-percent:0;mso-height-percent:0;mso-width-relative:page;mso-height-relative:page;v-text-anchor:top" o:gfxdata="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" filled="f" strokeweight=".72pt">
                 <w10:wrap anchorx="page"/>
               </v:rect>
             </w:pict>
@@ -11972,7 +12043,19 @@
         <w:rPr>
           <w:i/>
         </w:rPr>
-        <w:t>hợp</w:t>
+        <w:t>h</w:t>
+      </w:r>
+      <w:r>
+        <w:rPr>
+          <w:i/>
+        </w:rPr>
+        <w:t>ợ</w:t>
+      </w:r>
+      <w:r>
+        <w:rPr>
+          <w:i/>
+        </w:rPr>
+        <w:t>p</w:t>
       </w:r>
       <w:r>
         <w:rPr>
@@ -11986,7 +12069,21 @@
           <w:i/>
           <w:spacing w:val="-4"/>
         </w:rPr>
-        <w:t>đồng</w:t>
+        <w:t>đ</w:t>
+      </w:r>
+      <w:r>
+        <w:rPr>
+          <w:i/>
+          <w:spacing w:val="-4"/>
+        </w:rPr>
+        <w:t>ồ</w:t>
+      </w:r>
+      <w:r>
+        <w:rPr>
+          <w:i/>
+          <w:spacing w:val="-4"/>
+        </w:rPr>
+        <w:t>ng</w:t>
       </w:r>
       <w:r>
         <w:rPr>
@@ -12169,7 +12266,19 @@
         <w:rPr>
           <w:b/>
         </w:rPr>
-        <w:t>Địa</w:t>
+        <w:t>Đ</w:t>
+      </w:r>
+      <w:r>
+        <w:rPr>
+          <w:b/>
+        </w:rPr>
+        <w:t>ị</w:t>
+      </w:r>
+      <w:r>
+        <w:rPr>
+          <w:b/>
+        </w:rPr>
+        <w:t>a</w:t>
       </w:r>
       <w:r>
         <w:rPr>
@@ -12182,7 +12291,19 @@
         <w:rPr>
           <w:b/>
         </w:rPr>
-        <w:t>điểm</w:t>
+        <w:t>đi</w:t>
+      </w:r>
+      <w:r>
+        <w:rPr>
+          <w:b/>
+        </w:rPr>
+        <w:t>ể</w:t>
+      </w:r>
+      <w:r>
+        <w:rPr>
+          <w:b/>
+        </w:rPr>
+        <w:t>m</w:t>
       </w:r>
       <w:r>
         <w:rPr>
@@ -12260,7 +12381,13 @@
         <w:t xml:space="preserve"> </w:t>
       </w:r>
       <w:r>
-        <w:t>động</w:t>
+        <w:t>đ</w:t>
+      </w:r>
+      <w:r>
+        <w:t>ộ</w:t>
+      </w:r>
+      <w:r>
+        <w:t>ng</w:t>
       </w:r>
       <w:r>
         <w:rPr>
@@ -12282,7 +12409,13 @@
         <w:t xml:space="preserve"> </w:t>
       </w:r>
       <w:r>
-        <w:t>Trạm</w:t>
+        <w:t>Tr</w:t>
+      </w:r>
+      <w:r>
+        <w:t>ạ</w:t>
+      </w:r>
+      <w:r>
+        <w:t>m</w:t>
       </w:r>
       <w:r>
         <w:rPr>
@@ -12300,7 +12433,10 @@
         <w:t xml:space="preserve"> </w:t>
       </w:r>
       <w:r>
-        <w:t>tế</w:t>
+        <w:t>t</w:t>
+      </w:r>
+      <w:r>
+        <w:t>ế</w:t>
       </w:r>
       <w:r>
         <w:rPr>
@@ -12322,7 +12458,13 @@
         <w:t xml:space="preserve"> </w:t>
       </w:r>
       <w:r>
-        <w:t>Trường</w:t>
+        <w:t>Trư</w:t>
+      </w:r>
+      <w:r>
+        <w:t>ờ</w:t>
+      </w:r>
+      <w:r>
+        <w:t>ng</w:t>
       </w:r>
       <w:r>
         <w:rPr>
@@ -12331,7 +12473,13 @@
         <w:t xml:space="preserve"> </w:t>
       </w:r>
       <w:r>
-        <w:t>học</w:t>
+        <w:t>h</w:t>
+      </w:r>
+      <w:r>
+        <w:t>ọ</w:t>
+      </w:r>
+      <w:r>
+        <w:t>c</w:t>
       </w:r>
       <w:r>
         <w:rPr>
@@ -34160,7 +34308,7 @@
         <v:path o:extrusionok="f" gradientshapeok="t" o:connecttype="rect"/>
         <o:lock v:ext="edit" aspectratio="t"/>
       </v:shapetype>
-      <v:shape id="_x0000_i1181" type="#_x0000_t75" style="width:21.75pt;height:22.5pt;visibility:visible;mso-wrap-style:square" o:bullet="t">
+      <v:shape id="_x0000_i1026" type="#_x0000_t75" style="width:21.75pt;height:22.55pt;visibility:visible;mso-wrap-style:square" o:bullet="t">
         <v:imagedata r:id="rId1" o:title=""/>
         <o:lock v:ext="edit" aspectratio="f"/>
       </v:shape>
@@ -34168,7 +34316,7 @@
   </w:numPicBullet>
   <w:numPicBullet w:numPicBulletId="1">
     <w:pict>
-      <v:shape id="_x0000_i1182" type="#_x0000_t75" style="width:21.75pt;height:21.75pt;visibility:visible;mso-wrap-style:square" o:bullet="t">
+      <v:shape id="_x0000_i1027" type="#_x0000_t75" style="width:21.75pt;height:21.75pt;visibility:visible;mso-wrap-style:square" o:bullet="t">
         <v:imagedata r:id="rId2" o:title=""/>
         <o:lock v:ext="edit" aspectratio="f"/>
       </v:shape>

</xml_diff>